<commit_message>
Revisi: Perbaiki DOCX alignment, perbaiki PDF blank, dan tambah subtitle Pengurus Musholla
</commit_message>
<xml_diff>
--- a/Laporan_Keuangan_Agustus_2026.docx
+++ b/Laporan_Keuangan_Agustus_2026.docx
@@ -4,7 +4,7 @@
   <w:body>
     <w:p>
       <w:pPr>
-        <w:spacing w:after="400"/>
+        <w:spacing w:after="60"/>
         <w:jc w:val="center"/>
       </w:pPr>
       <w:r>
@@ -14,6 +14,19 @@
           <w:sz w:val="28"/>
         </w:rPr>
         <w:t>Agustus 2026</w:t>
+      </w:r>
+    </w:p>
+    <w:p>
+      <w:pPr>
+        <w:spacing w:after="360"/>
+        <w:jc w:val="center"/>
+      </w:pPr>
+      <w:r>
+        <w:rPr>
+          <w:rFonts w:ascii="Arial" w:hAnsi="Arial"/>
+          <w:sz w:val="22"/>
+        </w:rPr>
+        <w:t>Pengurus Musholla ....</w:t>
       </w:r>
     </w:p>
     <w:tbl>

</xml_diff>